<commit_message>
Improve reception guest ops and security dashboard workflows.
Add visit reasons, period Excel export, journal notes/checkout ID controls; show people-inside and AxTrax-style live events on security with faster company search.

Co-authored-by: Cursor <cursoragent@cursor.com>
</commit_message>
<xml_diff>
--- a/docs/deployment/CityPoint_AlmaLinux10_Native_Offline_Rehberi.docx
+++ b/docs/deployment/CityPoint_AlmaLinux10_Native_Offline_Rehberi.docx
@@ -40,7 +40,7 @@
           <w:color w:val="64748B"/>
           <w:sz w:val="18"/>
         </w:rPr>
-        <w:t>Versiya: 2.0  ·  Tarix: 2026-10-05  ·  Auditoriya: NetAdmin / SysAdmin / ERP ops</w:t>
+        <w:t>Versiya: 3.0  ·  Tarix: 2026-10-08  ·  Auditoriya: NetAdmin / SysAdmin / ERP ops  ·  ÖZÜNÜ-KİFAYƏT</w:t>
       </w:r>
     </w:p>
     <w:p>
@@ -50,10 +50,49 @@
       <w:r>
         <w:rPr>
           <w:rFonts w:ascii="Calibri" w:hAnsi="Calibri" w:eastAsia="Calibri"/>
+          <w:b/>
+          <w:sz w:val="22"/>
+        </w:rPr>
+        <w:t>Bu sənəd ÖZÜNÜ-KİFAYƏTDİR. AlmaLinux 10-da sistemi qaldırmaq üçün lazım olan bütün əmrlər, SQL, Nginx, systemd, .env, firewall, backup, AxTrax və go-live yoxlamaları buradadır. Başqa markdown/GitHub səhifəsinə baxmağa ehtiyac yoxdur — yalnız USB-dən gələn citypoint-app.zip (Django mənbə kodu) + wheelhouse + offline RPM qovluqları lazımdır. NetAdmin variant seçib (A/B/C × I/II/III) aşağıdakı hazır kod bloklarını bir-bir kopyalayıb serverə yapışdırır.</w:t>
+      </w:r>
+    </w:p>
+    <w:p>
+      <w:pPr>
+        <w:pStyle w:val="ListBullet"/>
+      </w:pPr>
+      <w:r>
+        <w:rPr>
+          <w:rFonts w:ascii="Calibri" w:hAnsi="Calibri" w:eastAsia="Calibri"/>
           <w:b w:val="0"/>
           <w:sz w:val="22"/>
         </w:rPr>
-        <w:t>Bu sənəd City Point sistemini binada AlmaLinux 10 serverində qaldırmaq üçündür. Rezident ofisləri binanın lokal LAN-ına qoşulu olmaya bilər — ona görə rezident girişi və server İnternet siyasəti üçün bir neçə variant verilir. NetAdmin öz vəziyyətinə uyğun variantı seçib, həmin bölmədəki hazır kod və konfiqurasiyaları tətbiq edir.</w:t>
+        <w:t>USB məzmunu: citypoint-app.zip + wheelhouse/ + rpms/ (bu sənədin §9–§10)</w:t>
+      </w:r>
+    </w:p>
+    <w:p>
+      <w:pPr>
+        <w:pStyle w:val="ListBullet"/>
+      </w:pPr>
+      <w:r>
+        <w:rPr>
+          <w:rFonts w:ascii="Calibri" w:hAnsi="Calibri" w:eastAsia="Calibri"/>
+          <w:b w:val="0"/>
+          <w:sz w:val="22"/>
+        </w:rPr>
+        <w:t>Bütün konfiq fayllarının TAM mətni §13 və §22 (Əlavə) bölmələrindədir</w:t>
+      </w:r>
+    </w:p>
+    <w:p>
+      <w:pPr>
+        <w:pStyle w:val="ListBullet"/>
+      </w:pPr>
+      <w:r>
+        <w:rPr>
+          <w:rFonts w:ascii="Calibri" w:hAnsi="Calibri" w:eastAsia="Calibri"/>
+          <w:b w:val="0"/>
+          <w:sz w:val="22"/>
+        </w:rPr>
+        <w:t>Docker bu rəhbərdə YOXDUR — native PostgreSQL + Gunicorn + Nginx + systemd</w:t>
       </w:r>
     </w:p>
     <w:p>
@@ -3530,16 +3569,16 @@
     </w:p>
     <w:p>
       <w:pPr>
-        <w:pStyle w:val="Heading1"/>
+        <w:pStyle w:val="Heading2"/>
       </w:pPr>
       <w:r>
         <w:rPr>
           <w:rFonts w:ascii="Calibri" w:hAnsi="Calibri" w:eastAsia="Calibri"/>
           <w:b/>
           <w:color w:val="1F497D"/>
-          <w:sz w:val="32"/>
+          <w:sz w:val="26"/>
         </w:rPr>
-        <w:t>15. AxTrax inteqrasiyası</w:t>
+        <w:t>14.3 Nginx aktivləşdirmə + SELinux</w:t>
       </w:r>
     </w:p>
     <w:p>
@@ -3552,13 +3591,32 @@
           <w:rFonts w:ascii="Consolas" w:hAnsi="Consolas" w:eastAsia="Consolas"/>
           <w:sz w:val="16"/>
         </w:rPr>
-        <w:t>nc -zv 172.31.104.10 1433</w:t>
-        <w:br/>
-        <w:t>sudo -u citypoint -H bash -c 'cd /opt/citypoint &amp;&amp; source .venv/bin/activate &amp;&amp; set -a &amp;&amp; source bin/prod/.env &amp;&amp; set +a &amp;&amp; python manage.py axtrax_sync_status'</w:t>
-        <w:br/>
-        <w:t>sudo -u citypoint -H bash -c 'cd /opt/citypoint &amp;&amp; source .venv/bin/activate &amp;&amp; set -a &amp;&amp; source bin/prod/.env &amp;&amp; set +a &amp;&amp; python manage.py backfill_axtrax_events --from=2026-09-01'</w:t>
-        <w:br/>
-        <w:t>tail -f /opt/citypoint/var/axtrax_poller.log</w:t>
+        <w:t># Variant A: §3-dəki iki conf faylını yazın</w:t>
+        <w:br/>
+        <w:t># Variant B: §4-dəki citypoint-internal.conf</w:t>
+        <w:br/>
+        <w:t># Variant C: §4-dəki kimi yalnız erp.citypoint.local</w:t>
+        <w:br/>
+        <w:t>sudo nginx -t</w:t>
+        <w:br/>
+        <w:t>sudo systemctl enable --now nginx</w:t>
+        <w:br/>
+        <w:t>sudo systemctl reload nginx</w:t>
+        <w:br/>
+        <w:br/>
+        <w:t># SELinux: Nginx → Gunicorn (127.0.0.1:8000)</w:t>
+        <w:br/>
+        <w:t>sudo setsebool -P httpd_can_network_connect 1</w:t>
+        <w:br/>
+        <w:t>sudo setsebool -P httpd_read_user_content 1</w:t>
+        <w:br/>
+        <w:t># static/media oxumaq üçün (lazım olarsa):</w:t>
+        <w:br/>
+        <w:t>sudo chcon -R -t httpd_sys_content_t /opt/citypoint/staticfiles /opt/citypoint/media</w:t>
+        <w:br/>
+        <w:t># və ya: sudo semanage fcontext -a -t httpd_sys_content_t '/opt/citypoint/(staticfiles|media)(/.*)?'</w:t>
+        <w:br/>
+        <w:t># sudo restorecon -Rv /opt/citypoint/staticfiles /opt/citypoint/media</w:t>
       </w:r>
     </w:p>
     <w:p>
@@ -3572,7 +3630,116 @@
           <w:color w:val="1F497D"/>
           <w:sz w:val="32"/>
         </w:rPr>
-        <w:t>16. Backup və restore</w:t>
+        <w:t>15. AxTrax inteqrasiyası (tam əmrlər)</w:t>
+      </w:r>
+    </w:p>
+    <w:p>
+      <w:pPr>
+        <w:spacing w:after="160" w:line="240" w:lineRule="auto"/>
+      </w:pPr>
+      <w:r>
+        <w:rPr>
+          <w:rFonts w:ascii="Calibri" w:hAnsi="Calibri" w:eastAsia="Calibri"/>
+          <w:b/>
+          <w:sz w:val="22"/>
+        </w:rPr>
+        <w:t>FreeTDS (pymssql) — /etc/freetds.conf nümunəsi:</w:t>
+      </w:r>
+    </w:p>
+    <w:p>
+      <w:pPr>
+        <w:spacing w:before="80" w:after="160"/>
+        <w:ind w:left="283"/>
+      </w:pPr>
+      <w:r>
+        <w:rPr>
+          <w:rFonts w:ascii="Consolas" w:hAnsi="Consolas" w:eastAsia="Consolas"/>
+          <w:sz w:val="16"/>
+        </w:rPr>
+        <w:t>sudo tee /etc/freetds.conf &lt;&lt;'EOF'</w:t>
+        <w:br/>
+        <w:t>[global]</w:t>
+        <w:br/>
+        <w:t xml:space="preserve">    tds version = 7.4</w:t>
+        <w:br/>
+        <w:t xml:space="preserve">    client charset = UTF-8</w:t>
+        <w:br/>
+        <w:br/>
+        <w:t>[axtrax]</w:t>
+        <w:br/>
+        <w:t xml:space="preserve">    host = 172.31.104.10</w:t>
+        <w:br/>
+        <w:t xml:space="preserve">    port = 1433</w:t>
+        <w:br/>
+        <w:t xml:space="preserve">    tds version = 7.4</w:t>
+        <w:br/>
+        <w:t>EOF</w:t>
+      </w:r>
+    </w:p>
+    <w:p>
+      <w:pPr>
+        <w:spacing w:before="80" w:after="160"/>
+        <w:ind w:left="283"/>
+      </w:pPr>
+      <w:r>
+        <w:rPr>
+          <w:rFonts w:ascii="Consolas" w:hAnsi="Consolas" w:eastAsia="Consolas"/>
+          <w:sz w:val="16"/>
+        </w:rPr>
+        <w:t># Şəbəkə yoxlama</w:t>
+        <w:br/>
+        <w:t>nc -zv 172.31.104.10 1433</w:t>
+        <w:br/>
+        <w:t># və ya: timeout 3 bash -c 'echo &gt;/dev/tcp/172.31.104.10/1433' &amp;&amp; echo OK</w:t>
+        <w:br/>
+        <w:br/>
+        <w:t>CP='sudo -u citypoint -H bash -c'</w:t>
+        <w:br/>
+        <w:t>RUN='cd /opt/citypoint &amp;&amp; source .venv/bin/activate &amp;&amp; set -a &amp;&amp; source bin/prod/.env &amp;&amp; set +a'</w:t>
+        <w:br/>
+        <w:br/>
+        <w:t>$CP "$RUN &amp;&amp; python manage.py axtrax_sync_status"</w:t>
+        <w:br/>
+        <w:t>$CP "$RUN &amp;&amp; python manage.py sync_axtrax_people --from-mssql"</w:t>
+        <w:br/>
+        <w:t>$CP "$RUN &amp;&amp; python manage.py poll_axtrax --once"</w:t>
+        <w:br/>
+        <w:t>$CP "$RUN &amp;&amp; python manage.py backfill_axtrax_events --from=2026-09-01"</w:t>
+        <w:br/>
+        <w:br/>
+        <w:t>sudo systemctl restart citypoint-axtrax</w:t>
+        <w:br/>
+        <w:t>sudo journalctl -u citypoint-axtrax -f</w:t>
+        <w:br/>
+        <w:t># və ya: tail -f /opt/citypoint/var/axtrax_poller.log</w:t>
+      </w:r>
+    </w:p>
+    <w:p>
+      <w:pPr>
+        <w:pStyle w:val="Heading1"/>
+      </w:pPr>
+      <w:r>
+        <w:rPr>
+          <w:rFonts w:ascii="Calibri" w:hAnsi="Calibri" w:eastAsia="Calibri"/>
+          <w:b/>
+          <w:color w:val="1F497D"/>
+          <w:sz w:val="32"/>
+        </w:rPr>
+        <w:t>16. Backup və restore (tam skriptlər)</w:t>
+      </w:r>
+    </w:p>
+    <w:p>
+      <w:pPr>
+        <w:pStyle w:val="Heading2"/>
+      </w:pPr>
+      <w:r>
+        <w:rPr>
+          <w:rFonts w:ascii="Calibri" w:hAnsi="Calibri" w:eastAsia="Calibri"/>
+          <w:b/>
+          <w:color w:val="1F497D"/>
+          <w:sz w:val="26"/>
+        </w:rPr>
+        <w:t>16.1 .pgpass + backup skripti</w:t>
       </w:r>
     </w:p>
     <w:p>
@@ -3591,14 +3758,160 @@
         <w:br/>
         <w:t>EOF</w:t>
         <w:br/>
-        <w:t>chmod 600 /opt/citypoint/.pgpass</w:t>
+        <w:t>sudo chmod 600 /opt/citypoint/.pgpass</w:t>
+        <w:br/>
+        <w:t>sudo chown citypoint:citypoint /opt/citypoint/.pgpass</w:t>
+        <w:br/>
+        <w:br/>
+        <w:t>sudo tee /usr/local/bin/citypoint-backup.sh &lt;&lt;'EOF'</w:t>
+        <w:br/>
+        <w:t>#!/bin/bash</w:t>
+        <w:br/>
+        <w:t>set -euo pipefail</w:t>
+        <w:br/>
+        <w:t>STAMP=$(date +%Y%m%d-%H%M)</w:t>
+        <w:br/>
+        <w:t>OUT=/backup/citypoint</w:t>
+        <w:br/>
+        <w:t>mkdir -p "$OUT"</w:t>
+        <w:br/>
+        <w:t>export PGPASSFILE=/opt/citypoint/.pgpass</w:t>
+        <w:br/>
+        <w:t>pg_dump -h 127.0.0.1 -U cp_app -d citypoint | gzip &gt; "$OUT/db-$STAMP.sql.gz"</w:t>
+        <w:br/>
+        <w:t>tar czf "$OUT/media-$STAMP.tar.gz" -C /opt/citypoint media</w:t>
+        <w:br/>
+        <w:t># 14 gündən köhnə sil</w:t>
+        <w:br/>
+        <w:t>find "$OUT" -type f -mtime +14 -name 'db-*.sql.gz' -delete</w:t>
+        <w:br/>
+        <w:t>find "$OUT" -type f -mtime +14 -name 'media-*.tar.gz' -delete</w:t>
+        <w:br/>
+        <w:t>EOF</w:t>
+        <w:br/>
+        <w:t>sudo chmod 755 /usr/local/bin/citypoint-backup.sh</w:t>
         <w:br/>
         <w:br/>
         <w:t>sudo tee /etc/cron.d/citypoint-backup &lt;&lt;'EOF'</w:t>
         <w:br/>
-        <w:t>15 2 * * * citypoint pg_dump -h 127.0.0.1 -U cp_app citypoint | gzip &gt; /backup/citypoint/db-$(date +\%Y\%m\%d).sql.gz</w:t>
-        <w:br/>
-        <w:t>30 2 * * * citypoint tar czf /backup/citypoint/media-$(date +\%Y\%m\%d).tar.gz -C /opt/citypoint media</w:t>
+        <w:t>SHELL=/bin/bash</w:t>
+        <w:br/>
+        <w:t>PATH=/usr/sbin:/usr/bin:/bin</w:t>
+        <w:br/>
+        <w:t>15 2 * * * citypoint /usr/local/bin/citypoint-backup.sh &gt;&gt; /backup/citypoint/backup.log 2&gt;&amp;1</w:t>
+        <w:br/>
+        <w:t>EOF</w:t>
+        <w:br/>
+        <w:t># Bir dəfə əl ilə yoxlayın:</w:t>
+        <w:br/>
+        <w:t>sudo -u citypoint /usr/local/bin/citypoint-backup.sh</w:t>
+        <w:br/>
+        <w:t>ls -lh /backup/citypoint/</w:t>
+      </w:r>
+    </w:p>
+    <w:p>
+      <w:pPr>
+        <w:pStyle w:val="Heading2"/>
+      </w:pPr>
+      <w:r>
+        <w:rPr>
+          <w:rFonts w:ascii="Calibri" w:hAnsi="Calibri" w:eastAsia="Calibri"/>
+          <w:b/>
+          <w:color w:val="1F497D"/>
+          <w:sz w:val="26"/>
+        </w:rPr>
+        <w:t>16.2 Restore (hadisə / drill)</w:t>
+      </w:r>
+    </w:p>
+    <w:p>
+      <w:pPr>
+        <w:spacing w:before="80" w:after="160"/>
+        <w:ind w:left="283"/>
+      </w:pPr>
+      <w:r>
+        <w:rPr>
+          <w:rFonts w:ascii="Consolas" w:hAnsi="Consolas" w:eastAsia="Consolas"/>
+          <w:sz w:val="16"/>
+        </w:rPr>
+        <w:t># 1) Yazıcıları dayandır</w:t>
+        <w:br/>
+        <w:t>sudo systemctl stop citypoint-web citypoint-axtrax</w:t>
+        <w:br/>
+        <w:br/>
+        <w:t># 2) DB bərpa (nümunə — ayrı test DB və ya prod)</w:t>
+        <w:br/>
+        <w:t>gunzip -c /backup/citypoint/db-YYYYMMDD-HHMM.sql.gz | \</w:t>
+        <w:br/>
+        <w:t xml:space="preserve">  sudo -u postgres psql -d citypoint</w:t>
+        <w:br/>
+        <w:br/>
+        <w:t># 3) Media</w:t>
+        <w:br/>
+        <w:t>sudo -u citypoint tar xzf /backup/citypoint/media-YYYYMMDD-HHMM.tar.gz -C /opt/citypoint</w:t>
+        <w:br/>
+        <w:br/>
+        <w:t># 4) Xidmətləri qaldır</w:t>
+        <w:br/>
+        <w:t>sudo systemctl start citypoint-web citypoint-axtrax</w:t>
+        <w:br/>
+        <w:t>sudo systemctl status citypoint-web --no-pager</w:t>
+      </w:r>
+    </w:p>
+    <w:p>
+      <w:pPr>
+        <w:pStyle w:val="Heading2"/>
+      </w:pPr>
+      <w:r>
+        <w:rPr>
+          <w:rFonts w:ascii="Calibri" w:hAnsi="Calibri" w:eastAsia="Calibri"/>
+          <w:b/>
+          <w:color w:val="1F497D"/>
+          <w:sz w:val="26"/>
+        </w:rPr>
+        <w:t>16.3 logrotate</w:t>
+      </w:r>
+    </w:p>
+    <w:p>
+      <w:pPr>
+        <w:spacing w:before="80" w:after="160"/>
+        <w:ind w:left="283"/>
+      </w:pPr>
+      <w:r>
+        <w:rPr>
+          <w:rFonts w:ascii="Consolas" w:hAnsi="Consolas" w:eastAsia="Consolas"/>
+          <w:sz w:val="16"/>
+        </w:rPr>
+        <w:t>sudo tee /etc/logrotate.d/citypoint &lt;&lt;'EOF'</w:t>
+        <w:br/>
+        <w:t>/opt/citypoint/var/axtrax_poller.log {</w:t>
+        <w:br/>
+        <w:t xml:space="preserve">    weekly</w:t>
+        <w:br/>
+        <w:t xml:space="preserve">    rotate 8</w:t>
+        <w:br/>
+        <w:t xml:space="preserve">    compress</w:t>
+        <w:br/>
+        <w:t xml:space="preserve">    missingok</w:t>
+        <w:br/>
+        <w:t xml:space="preserve">    notifempty</w:t>
+        <w:br/>
+        <w:t xml:space="preserve">    copytruncate</w:t>
+        <w:br/>
+        <w:t>}</w:t>
+        <w:br/>
+        <w:t>/backup/citypoint/backup.log {</w:t>
+        <w:br/>
+        <w:t xml:space="preserve">    monthly</w:t>
+        <w:br/>
+        <w:t xml:space="preserve">    rotate 6</w:t>
+        <w:br/>
+        <w:t xml:space="preserve">    compress</w:t>
+        <w:br/>
+        <w:t xml:space="preserve">    missingok</w:t>
+        <w:br/>
+        <w:t xml:space="preserve">    notifempty</w:t>
+        <w:br/>
+        <w:t>}</w:t>
         <w:br/>
         <w:t>EOF</w:t>
       </w:r>
@@ -4321,6 +4634,59 @@
     <w:p/>
     <w:p>
       <w:pPr>
+        <w:pStyle w:val="Heading2"/>
+      </w:pPr>
+      <w:r>
+        <w:rPr>
+          <w:rFonts w:ascii="Calibri" w:hAnsi="Calibri" w:eastAsia="Calibri"/>
+          <w:b/>
+          <w:color w:val="1F497D"/>
+          <w:sz w:val="26"/>
+        </w:rPr>
+        <w:t>17.1 Yeniləmə proseduru (air-gap)</w:t>
+      </w:r>
+    </w:p>
+    <w:p>
+      <w:pPr>
+        <w:spacing w:before="80" w:after="160"/>
+        <w:ind w:left="283"/>
+      </w:pPr>
+      <w:r>
+        <w:rPr>
+          <w:rFonts w:ascii="Consolas" w:hAnsi="Consolas" w:eastAsia="Consolas"/>
+          <w:sz w:val="16"/>
+        </w:rPr>
+        <w:t># Build maşını: yeni zip + (lazım olsa) yeni wheelhouse → USB</w:t>
+        <w:br/>
+        <w:t>sudo systemctl stop citypoint-web citypoint-axtrax</w:t>
+        <w:br/>
+        <w:t>sudo -u citypoint /usr/local/bin/citypoint-backup.sh</w:t>
+        <w:br/>
+        <w:t>sudo unzip -o /mnt/usb/citypoint-app.zip -d /opt/citypoint</w:t>
+        <w:br/>
+        <w:t>sudo cp -a /mnt/usb/wheelhouse/. /opt/offline/wheelhouse/  # əgər dəyişibsə</w:t>
+        <w:br/>
+        <w:t>sudo -u citypoint -H bash &lt;&lt;'EOF'</w:t>
+        <w:br/>
+        <w:t>cd /opt/citypoint</w:t>
+        <w:br/>
+        <w:t>source .venv/bin/activate</w:t>
+        <w:br/>
+        <w:t>pip install --no-index --find-links=/opt/offline/wheelhouse -r requirements.txt</w:t>
+        <w:br/>
+        <w:t>set -a; source bin/prod/.env; export POSTGRES_USER=cp_migrator; export POSTGRES_PASSWORD=CHANGE_ME_MIGRATOR; set +a</w:t>
+        <w:br/>
+        <w:t>python manage.py migrate --noinput</w:t>
+        <w:br/>
+        <w:t>python manage.py collectstatic --noinput</w:t>
+        <w:br/>
+        <w:t>EOF</w:t>
+        <w:br/>
+        <w:t>sudo systemctl start citypoint-web citypoint-axtrax</w:t>
+      </w:r>
+    </w:p>
+    <w:p>
+      <w:pPr>
         <w:pStyle w:val="Heading1"/>
       </w:pPr>
       <w:r>
@@ -4345,11 +4711,25 @@
         </w:rPr>
         <w:t>curl -sI http://127.0.0.1:8000/login/ | head -1</w:t>
         <w:br/>
-        <w:t>curl -sI https://portal.citypoint.az/login/ | head -1</w:t>
-        <w:br/>
-        <w:t>sudo -u citypoint -H bash -c 'cd /opt/citypoint &amp;&amp; source .venv/bin/activate &amp;&amp; set -a &amp;&amp; source bin/prod/.env &amp;&amp; set +a &amp;&amp; python manage.py check --deploy'</w:t>
-        <w:br/>
-        <w:t>sudo systemctl is-active citypoint-web citypoint-axtrax postgresql nginx</w:t>
+        <w:t>curl -sI https://portal.citypoint.az/login/ | head -1   # variant A</w:t>
+        <w:br/>
+        <w:t>curl -sI http://erp.citypoint.local/login/ | head -1    # variant B/C</w:t>
+        <w:br/>
+        <w:br/>
+        <w:t>CP='sudo -u citypoint -H bash -c'</w:t>
+        <w:br/>
+        <w:t>RUN='cd /opt/citypoint &amp;&amp; source .venv/bin/activate &amp;&amp; set -a &amp;&amp; source bin/prod/.env &amp;&amp; set +a'</w:t>
+        <w:br/>
+        <w:t>$CP "$RUN &amp;&amp; python manage.py check --deploy"</w:t>
+        <w:br/>
+        <w:t>$CP "$RUN &amp;&amp; python manage.py axtrax_sync_status"</w:t>
+        <w:br/>
+        <w:br/>
+        <w:t>sudo systemctl is-active citypoint-web citypoint-axtrax postgresql nginx chronyd</w:t>
+        <w:br/>
+        <w:t>sudo ss -lntp | egrep ':80|:443|:8000|:5432'</w:t>
+        <w:br/>
+        <w:t># 8000 və 5432 yalnız 127.0.0.1 olmalıdır</w:t>
       </w:r>
     </w:p>
     <w:p>
@@ -4428,7 +4808,7 @@
           <w:b w:val="0"/>
           <w:sz w:val="22"/>
         </w:rPr>
-        <w:t>[ ] AxTrax sync_status OK; test kart oxutma</w:t>
+        <w:t>[ ] AxTrax sync_status OK; people sync; test kart oxutma</w:t>
       </w:r>
     </w:p>
     <w:p>
@@ -4455,6 +4835,32 @@
           <w:sz w:val="22"/>
         </w:rPr>
         <w:t>[ ] Reboot test: systemctl enable xidmətlər qalxır</w:t>
+      </w:r>
+    </w:p>
+    <w:p>
+      <w:pPr>
+        <w:pStyle w:val="ListBullet"/>
+      </w:pPr>
+      <w:r>
+        <w:rPr>
+          <w:rFonts w:ascii="Calibri" w:hAnsi="Calibri" w:eastAsia="Calibri"/>
+          <w:b w:val="0"/>
+          <w:sz w:val="22"/>
+        </w:rPr>
+        <w:t>[ ] İkonlar/şriftlər CDN olmadan yüklənir (Brauzer DevTools Network)</w:t>
+      </w:r>
+    </w:p>
+    <w:p>
+      <w:pPr>
+        <w:pStyle w:val="ListBullet"/>
+      </w:pPr>
+      <w:r>
+        <w:rPr>
+          <w:rFonts w:ascii="Calibri" w:hAnsi="Calibri" w:eastAsia="Calibri"/>
+          <w:b w:val="0"/>
+          <w:sz w:val="22"/>
+        </w:rPr>
+        <w:t>[ ] Invite: --base-url düzgün FQDN; və ya mail_outbox-dan link kopyalanır</w:t>
       </w:r>
     </w:p>
     <w:p>
@@ -4561,7 +4967,7 @@
                 <w:b w:val="0"/>
                 <w:sz w:val="18"/>
               </w:rPr>
-              <w:t>systemctl status citypoint-web</w:t>
+              <w:t>journalctl -u citypoint-web -n 50</w:t>
             </w:r>
           </w:p>
         </w:tc>
@@ -4577,7 +4983,7 @@
                 <w:b w:val="0"/>
                 <w:sz w:val="18"/>
               </w:rPr>
-              <w:t>Gunicorn log; .env; migrate</w:t>
+              <w:t>Gunicorn; .env; migrate; SELinux bool</w:t>
             </w:r>
           </w:p>
         </w:tc>
@@ -4627,7 +5033,7 @@
                 <w:b w:val="0"/>
                 <w:sz w:val="18"/>
               </w:rPr>
-              <w:t>https/http uyğunluğu; Nginx X-Forwarded-Proto</w:t>
+              <w:t>https/http; Nginx X-Forwarded-Proto</w:t>
             </w:r>
           </w:p>
         </w:tc>
@@ -4711,7 +5117,7 @@
                 <w:b w:val="0"/>
                 <w:sz w:val="18"/>
               </w:rPr>
-              <w:t>nc 1433; poller log</w:t>
+              <w:t>nc 1433; journalctl -u citypoint-axtrax</w:t>
             </w:r>
           </w:p>
         </w:tc>
@@ -4727,7 +5133,7 @@
                 <w:b w:val="0"/>
                 <w:sz w:val="18"/>
               </w:rPr>
-              <w:t>TURNSTILE_MSSQL_PASSWORD; firewall OUT</w:t>
+              <w:t>PASSWORD; firewall OUT; freetds</w:t>
             </w:r>
           </w:p>
         </w:tc>
@@ -4745,7 +5151,7 @@
                 <w:b w:val="0"/>
                 <w:sz w:val="18"/>
               </w:rPr>
-              <w:t>pymssql error</w:t>
+              <w:t>pymssql ImportError</w:t>
             </w:r>
           </w:p>
         </w:tc>
@@ -4761,7 +5167,7 @@
                 <w:b w:val="0"/>
                 <w:sz w:val="18"/>
               </w:rPr>
-              <w:t>ldd .venv .../pymssql</w:t>
+              <w:t>ldd .venv/.../pymssql*.so</w:t>
             </w:r>
           </w:p>
         </w:tc>
@@ -4777,7 +5183,7 @@
                 <w:b w:val="0"/>
                 <w:sz w:val="18"/>
               </w:rPr>
-              <w:t>freetds RPM quraşdır</w:t>
+              <w:t>freetds / freetds-libs RPM</w:t>
             </w:r>
           </w:p>
         </w:tc>
@@ -4795,7 +5201,7 @@
                 <w:b w:val="0"/>
                 <w:sz w:val="18"/>
               </w:rPr>
-              <w:t>pip Internet</w:t>
+              <w:t>pip Internet istəyir</w:t>
             </w:r>
           </w:p>
         </w:tc>
@@ -4811,7 +5217,7 @@
                 <w:b w:val="0"/>
                 <w:sz w:val="18"/>
               </w:rPr>
-              <w:t>pip install</w:t>
+              <w:t>pip install log</w:t>
             </w:r>
           </w:p>
         </w:tc>
@@ -4827,7 +5233,7 @@
                 <w:b w:val="0"/>
                 <w:sz w:val="18"/>
               </w:rPr>
-              <w:t>--no-index --find-links wheelhouse</w:t>
+              <w:t>--no-index --find-links=/opt/offline/wheelhouse</w:t>
             </w:r>
           </w:p>
         </w:tc>
@@ -4861,7 +5267,7 @@
                 <w:b w:val="0"/>
                 <w:sz w:val="18"/>
               </w:rPr>
-              <w:t>ls staticfiles</w:t>
+              <w:t>ls /opt/citypoint/staticfiles</w:t>
             </w:r>
           </w:p>
         </w:tc>
@@ -4877,7 +5283,107 @@
                 <w:b w:val="0"/>
                 <w:sz w:val="18"/>
               </w:rPr>
-              <w:t>collectstatic; nginx alias</w:t>
+              <w:t>collectstatic; nginx alias; SELinux</w:t>
+            </w:r>
+          </w:p>
+        </w:tc>
+      </w:tr>
+      <w:tr>
+        <w:tc>
+          <w:tcPr>
+            <w:tcW w:type="dxa" w:w="3249"/>
+          </w:tcPr>
+          <w:p>
+            <w:r/>
+            <w:r>
+              <w:rPr>
+                <w:rFonts w:ascii="Calibri" w:hAnsi="Calibri" w:eastAsia="Calibri"/>
+                <w:b w:val="0"/>
+                <w:sz w:val="18"/>
+              </w:rPr>
+              <w:t>DB connection refused</w:t>
+            </w:r>
+          </w:p>
+        </w:tc>
+        <w:tc>
+          <w:tcPr>
+            <w:tcW w:type="dxa" w:w="3249"/>
+          </w:tcPr>
+          <w:p>
+            <w:r/>
+            <w:r>
+              <w:rPr>
+                <w:rFonts w:ascii="Calibri" w:hAnsi="Calibri" w:eastAsia="Calibri"/>
+                <w:b w:val="0"/>
+                <w:sz w:val="18"/>
+              </w:rPr>
+              <w:t>ss -lntp | grep 5432</w:t>
+            </w:r>
+          </w:p>
+        </w:tc>
+        <w:tc>
+          <w:tcPr>
+            <w:tcW w:type="dxa" w:w="3249"/>
+          </w:tcPr>
+          <w:p>
+            <w:r/>
+            <w:r>
+              <w:rPr>
+                <w:rFonts w:ascii="Calibri" w:hAnsi="Calibri" w:eastAsia="Calibri"/>
+                <w:b w:val="0"/>
+                <w:sz w:val="18"/>
+              </w:rPr>
+              <w:t>listen_addresses=localhost; pg_hba</w:t>
+            </w:r>
+          </w:p>
+        </w:tc>
+      </w:tr>
+      <w:tr>
+        <w:tc>
+          <w:tcPr>
+            <w:tcW w:type="dxa" w:w="3249"/>
+          </w:tcPr>
+          <w:p>
+            <w:r/>
+            <w:r>
+              <w:rPr>
+                <w:rFonts w:ascii="Calibri" w:hAnsi="Calibri" w:eastAsia="Calibri"/>
+                <w:b w:val="0"/>
+                <w:sz w:val="18"/>
+              </w:rPr>
+              <w:t>Permission denied media</w:t>
+            </w:r>
+          </w:p>
+        </w:tc>
+        <w:tc>
+          <w:tcPr>
+            <w:tcW w:type="dxa" w:w="3249"/>
+          </w:tcPr>
+          <w:p>
+            <w:r/>
+            <w:r>
+              <w:rPr>
+                <w:rFonts w:ascii="Calibri" w:hAnsi="Calibri" w:eastAsia="Calibri"/>
+                <w:b w:val="0"/>
+                <w:sz w:val="18"/>
+              </w:rPr>
+              <w:t>ls -la /opt/citypoint/media</w:t>
+            </w:r>
+          </w:p>
+        </w:tc>
+        <w:tc>
+          <w:tcPr>
+            <w:tcW w:type="dxa" w:w="3249"/>
+          </w:tcPr>
+          <w:p>
+            <w:r/>
+            <w:r>
+              <w:rPr>
+                <w:rFonts w:ascii="Calibri" w:hAnsi="Calibri" w:eastAsia="Calibri"/>
+                <w:b w:val="0"/>
+                <w:sz w:val="18"/>
+              </w:rPr>
+              <w:t>chown citypoint; SELinux context</w:t>
             </w:r>
           </w:p>
         </w:tc>
@@ -4971,7 +5477,7 @@
                 <w:b w:val="0"/>
                 <w:sz w:val="18"/>
               </w:rPr>
-              <w:t>Layihə kökü</w:t>
+              <w:t>Layihə kökü (USB zip)</w:t>
             </w:r>
           </w:p>
         </w:tc>
@@ -5057,6 +5563,40 @@
                 <w:b w:val="0"/>
                 <w:sz w:val="18"/>
               </w:rPr>
+              <w:t>/opt/citypoint/requirements.txt</w:t>
+            </w:r>
+          </w:p>
+        </w:tc>
+        <w:tc>
+          <w:tcPr>
+            <w:tcW w:type="dxa" w:w="4873"/>
+          </w:tcPr>
+          <w:p>
+            <w:r/>
+            <w:r>
+              <w:rPr>
+                <w:rFonts w:ascii="Calibri" w:hAnsi="Calibri" w:eastAsia="Calibri"/>
+                <w:b w:val="0"/>
+                <w:sz w:val="18"/>
+              </w:rPr>
+              <w:t>Python asılılıqları (aşağıda tam)</w:t>
+            </w:r>
+          </w:p>
+        </w:tc>
+      </w:tr>
+      <w:tr>
+        <w:tc>
+          <w:tcPr>
+            <w:tcW w:type="dxa" w:w="4873"/>
+          </w:tcPr>
+          <w:p>
+            <w:r/>
+            <w:r>
+              <w:rPr>
+                <w:rFonts w:ascii="Calibri" w:hAnsi="Calibri" w:eastAsia="Calibri"/>
+                <w:b w:val="0"/>
+                <w:sz w:val="18"/>
+              </w:rPr>
               <w:t>/opt/citypoint/staticfiles</w:t>
             </w:r>
           </w:p>
@@ -5073,7 +5613,7 @@
                 <w:b w:val="0"/>
                 <w:sz w:val="18"/>
               </w:rPr>
-              <w:t>collectstatic</w:t>
+              <w:t>collectstatic çıxışı</w:t>
             </w:r>
           </w:p>
         </w:tc>
@@ -5141,7 +5681,245 @@
                 <w:b w:val="0"/>
                 <w:sz w:val="18"/>
               </w:rPr>
-              <w:t>CP_OFFLINE=1 mail</w:t>
+              <w:t>CP_OFFLINE=1 mail faylları</w:t>
+            </w:r>
+          </w:p>
+        </w:tc>
+      </w:tr>
+      <w:tr>
+        <w:tc>
+          <w:tcPr>
+            <w:tcW w:type="dxa" w:w="4873"/>
+          </w:tcPr>
+          <w:p>
+            <w:r/>
+            <w:r>
+              <w:rPr>
+                <w:rFonts w:ascii="Calibri" w:hAnsi="Calibri" w:eastAsia="Calibri"/>
+                <w:b w:val="0"/>
+                <w:sz w:val="18"/>
+              </w:rPr>
+              <w:t>/opt/citypoint/var/axtrax_poller.log</w:t>
+            </w:r>
+          </w:p>
+        </w:tc>
+        <w:tc>
+          <w:tcPr>
+            <w:tcW w:type="dxa" w:w="4873"/>
+          </w:tcPr>
+          <w:p>
+            <w:r/>
+            <w:r>
+              <w:rPr>
+                <w:rFonts w:ascii="Calibri" w:hAnsi="Calibri" w:eastAsia="Calibri"/>
+                <w:b w:val="0"/>
+                <w:sz w:val="18"/>
+              </w:rPr>
+              <w:t>AxTrax poller log</w:t>
+            </w:r>
+          </w:p>
+        </w:tc>
+      </w:tr>
+      <w:tr>
+        <w:tc>
+          <w:tcPr>
+            <w:tcW w:type="dxa" w:w="4873"/>
+          </w:tcPr>
+          <w:p>
+            <w:r/>
+            <w:r>
+              <w:rPr>
+                <w:rFonts w:ascii="Calibri" w:hAnsi="Calibri" w:eastAsia="Calibri"/>
+                <w:b w:val="0"/>
+                <w:sz w:val="18"/>
+              </w:rPr>
+              <w:t>/etc/systemd/system/citypoint-web.service</w:t>
+            </w:r>
+          </w:p>
+        </w:tc>
+        <w:tc>
+          <w:tcPr>
+            <w:tcW w:type="dxa" w:w="4873"/>
+          </w:tcPr>
+          <w:p>
+            <w:r/>
+            <w:r>
+              <w:rPr>
+                <w:rFonts w:ascii="Calibri" w:hAnsi="Calibri" w:eastAsia="Calibri"/>
+                <w:b w:val="0"/>
+                <w:sz w:val="18"/>
+              </w:rPr>
+              <w:t>Gunicorn unit</w:t>
+            </w:r>
+          </w:p>
+        </w:tc>
+      </w:tr>
+      <w:tr>
+        <w:tc>
+          <w:tcPr>
+            <w:tcW w:type="dxa" w:w="4873"/>
+          </w:tcPr>
+          <w:p>
+            <w:r/>
+            <w:r>
+              <w:rPr>
+                <w:rFonts w:ascii="Calibri" w:hAnsi="Calibri" w:eastAsia="Calibri"/>
+                <w:b w:val="0"/>
+                <w:sz w:val="18"/>
+              </w:rPr>
+              <w:t>/etc/systemd/system/citypoint-axtrax.service</w:t>
+            </w:r>
+          </w:p>
+        </w:tc>
+        <w:tc>
+          <w:tcPr>
+            <w:tcW w:type="dxa" w:w="4873"/>
+          </w:tcPr>
+          <w:p>
+            <w:r/>
+            <w:r>
+              <w:rPr>
+                <w:rFonts w:ascii="Calibri" w:hAnsi="Calibri" w:eastAsia="Calibri"/>
+                <w:b w:val="0"/>
+                <w:sz w:val="18"/>
+              </w:rPr>
+              <w:t>AxTrax poller unit</w:t>
+            </w:r>
+          </w:p>
+        </w:tc>
+      </w:tr>
+      <w:tr>
+        <w:tc>
+          <w:tcPr>
+            <w:tcW w:type="dxa" w:w="4873"/>
+          </w:tcPr>
+          <w:p>
+            <w:r/>
+            <w:r>
+              <w:rPr>
+                <w:rFonts w:ascii="Calibri" w:hAnsi="Calibri" w:eastAsia="Calibri"/>
+                <w:b w:val="0"/>
+                <w:sz w:val="18"/>
+              </w:rPr>
+              <w:t>/etc/nginx/conf.d/*.conf</w:t>
+            </w:r>
+          </w:p>
+        </w:tc>
+        <w:tc>
+          <w:tcPr>
+            <w:tcW w:type="dxa" w:w="4873"/>
+          </w:tcPr>
+          <w:p>
+            <w:r/>
+            <w:r>
+              <w:rPr>
+                <w:rFonts w:ascii="Calibri" w:hAnsi="Calibri" w:eastAsia="Calibri"/>
+                <w:b w:val="0"/>
+                <w:sz w:val="18"/>
+              </w:rPr>
+              <w:t>Nginx vhost</w:t>
+            </w:r>
+          </w:p>
+        </w:tc>
+      </w:tr>
+      <w:tr>
+        <w:tc>
+          <w:tcPr>
+            <w:tcW w:type="dxa" w:w="4873"/>
+          </w:tcPr>
+          <w:p>
+            <w:r/>
+            <w:r>
+              <w:rPr>
+                <w:rFonts w:ascii="Calibri" w:hAnsi="Calibri" w:eastAsia="Calibri"/>
+                <w:b w:val="0"/>
+                <w:sz w:val="18"/>
+              </w:rPr>
+              <w:t>/etc/freetds.conf</w:t>
+            </w:r>
+          </w:p>
+        </w:tc>
+        <w:tc>
+          <w:tcPr>
+            <w:tcW w:type="dxa" w:w="4873"/>
+          </w:tcPr>
+          <w:p>
+            <w:r/>
+            <w:r>
+              <w:rPr>
+                <w:rFonts w:ascii="Calibri" w:hAnsi="Calibri" w:eastAsia="Calibri"/>
+                <w:b w:val="0"/>
+                <w:sz w:val="18"/>
+              </w:rPr>
+              <w:t>MSSQL client</w:t>
+            </w:r>
+          </w:p>
+        </w:tc>
+      </w:tr>
+      <w:tr>
+        <w:tc>
+          <w:tcPr>
+            <w:tcW w:type="dxa" w:w="4873"/>
+          </w:tcPr>
+          <w:p>
+            <w:r/>
+            <w:r>
+              <w:rPr>
+                <w:rFonts w:ascii="Calibri" w:hAnsi="Calibri" w:eastAsia="Calibri"/>
+                <w:b w:val="0"/>
+                <w:sz w:val="18"/>
+              </w:rPr>
+              <w:t>/usr/local/bin/citypoint-backup.sh</w:t>
+            </w:r>
+          </w:p>
+        </w:tc>
+        <w:tc>
+          <w:tcPr>
+            <w:tcW w:type="dxa" w:w="4873"/>
+          </w:tcPr>
+          <w:p>
+            <w:r/>
+            <w:r>
+              <w:rPr>
+                <w:rFonts w:ascii="Calibri" w:hAnsi="Calibri" w:eastAsia="Calibri"/>
+                <w:b w:val="0"/>
+                <w:sz w:val="18"/>
+              </w:rPr>
+              <w:t>Backup skripti</w:t>
+            </w:r>
+          </w:p>
+        </w:tc>
+      </w:tr>
+      <w:tr>
+        <w:tc>
+          <w:tcPr>
+            <w:tcW w:type="dxa" w:w="4873"/>
+          </w:tcPr>
+          <w:p>
+            <w:r/>
+            <w:r>
+              <w:rPr>
+                <w:rFonts w:ascii="Calibri" w:hAnsi="Calibri" w:eastAsia="Calibri"/>
+                <w:b w:val="0"/>
+                <w:sz w:val="18"/>
+              </w:rPr>
+              <w:t>/etc/cron.d/citypoint-backup</w:t>
+            </w:r>
+          </w:p>
+        </w:tc>
+        <w:tc>
+          <w:tcPr>
+            <w:tcW w:type="dxa" w:w="4873"/>
+          </w:tcPr>
+          <w:p>
+            <w:r/>
+            <w:r>
+              <w:rPr>
+                <w:rFonts w:ascii="Calibri" w:hAnsi="Calibri" w:eastAsia="Calibri"/>
+                <w:b w:val="0"/>
+                <w:sz w:val="18"/>
+              </w:rPr>
+              <w:t>Gündəlik backup</w:t>
             </w:r>
           </w:p>
         </w:tc>
@@ -5209,7 +5987,7 @@
                 <w:b w:val="0"/>
                 <w:sz w:val="18"/>
               </w:rPr>
-              <w:t>Offline pip</w:t>
+              <w:t>Offline pip wheels</w:t>
             </w:r>
           </w:p>
         </w:tc>
@@ -5243,7 +6021,7 @@
                 <w:b w:val="0"/>
                 <w:sz w:val="18"/>
               </w:rPr>
-              <w:t>Offline dnf</w:t>
+              <w:t>Offline dnf RPMs</w:t>
             </w:r>
           </w:p>
         </w:tc>
@@ -5261,7 +6039,960 @@
           <w:color w:val="1F497D"/>
           <w:sz w:val="32"/>
         </w:rPr>
-        <w:t>21. Qəbul imzası</w:t>
+        <w:t>22. Əlavə — TAM kod faylları (kopyala-yapışdır)</w:t>
+      </w:r>
+    </w:p>
+    <w:p>
+      <w:pPr>
+        <w:spacing w:after="160" w:line="240" w:lineRule="auto"/>
+      </w:pPr>
+      <w:r>
+        <w:rPr>
+          <w:rFonts w:ascii="Calibri" w:hAnsi="Calibri" w:eastAsia="Calibri"/>
+          <w:b/>
+          <w:sz w:val="22"/>
+        </w:rPr>
+        <w:t>Aşağıdakı bloklar bu sənədin yuxarıdakı bölmələri ilə eynidir, lakin NetAdmin üçün bir yerdə toplanıb. Hər faylı qeyd olunmuş yola yazın.</w:t>
+      </w:r>
+    </w:p>
+    <w:p>
+      <w:pPr>
+        <w:pStyle w:val="Heading2"/>
+      </w:pPr>
+      <w:r>
+        <w:rPr>
+          <w:rFonts w:ascii="Calibri" w:hAnsi="Calibri" w:eastAsia="Calibri"/>
+          <w:b/>
+          <w:color w:val="1F497D"/>
+          <w:sz w:val="26"/>
+        </w:rPr>
+        <w:t>22.1 requirements.txt (layihə kökü — USB zip-də olmalıdır)</w:t>
+      </w:r>
+    </w:p>
+    <w:p>
+      <w:pPr>
+        <w:spacing w:before="80" w:after="160"/>
+        <w:ind w:left="283"/>
+      </w:pPr>
+      <w:r>
+        <w:rPr>
+          <w:rFonts w:ascii="Consolas" w:hAnsi="Consolas" w:eastAsia="Consolas"/>
+          <w:sz w:val="16"/>
+        </w:rPr>
+        <w:t>Django&gt;=5.1,&lt;5.3</w:t>
+        <w:br/>
+        <w:t>psycopg[binary]&gt;=3.2</w:t>
+        <w:br/>
+        <w:t>gunicorn&gt;=23.0</w:t>
+        <w:br/>
+        <w:t>python-dotenv&gt;=1.0</w:t>
+        <w:br/>
+        <w:t>Pillow&gt;=11.0</w:t>
+        <w:br/>
+        <w:t>whitenoise&gt;=6.8</w:t>
+        <w:br/>
+        <w:t>pymssql&gt;=2.3</w:t>
+        <w:br/>
+        <w:t>openpyxl&gt;=3.1</w:t>
+      </w:r>
+    </w:p>
+    <w:p>
+      <w:pPr>
+        <w:pStyle w:val="Heading2"/>
+      </w:pPr>
+      <w:r>
+        <w:rPr>
+          <w:rFonts w:ascii="Calibri" w:hAnsi="Calibri" w:eastAsia="Calibri"/>
+          <w:b/>
+          <w:color w:val="1F497D"/>
+          <w:sz w:val="26"/>
+        </w:rPr>
+        <w:t>22.2 /opt/citypoint/bin/prod/.env (native prod — TAM)</w:t>
+      </w:r>
+    </w:p>
+    <w:p>
+      <w:pPr>
+        <w:spacing w:before="80" w:after="160"/>
+        <w:ind w:left="283"/>
+      </w:pPr>
+      <w:r>
+        <w:rPr>
+          <w:rFonts w:ascii="Consolas" w:hAnsi="Consolas" w:eastAsia="Consolas"/>
+          <w:sz w:val="16"/>
+        </w:rPr>
+        <w:t>CP_ENV=production</w:t>
+        <w:br/>
+        <w:t>CP_OFFLINE=1</w:t>
+        <w:br/>
+        <w:t>DJANGO_SECRET_KEY=REPLACE_WITH_STRONG_RANDOM</w:t>
+        <w:br/>
+        <w:t>DJANGO_DEBUG=0</w:t>
+        <w:br/>
+        <w:t>SEED_DEMO=0</w:t>
+        <w:br/>
+        <w:br/>
+        <w:t># === Variant A nümunə (public portal + daxili ERP) ===</w:t>
+        <w:br/>
+        <w:t>DJANGO_ALLOWED_HOSTS=portal.citypoint.az,erp.citypoint.local,10.20.30.40</w:t>
+        <w:br/>
+        <w:t>DJANGO_CSRF_TRUSTED_ORIGINS=https://portal.citypoint.az,https://erp.citypoint.local</w:t>
+        <w:br/>
+        <w:t>SESSION_COOKIE_SECURE=1</w:t>
+        <w:br/>
+        <w:t>CSRF_COOKIE_SECURE=1</w:t>
+        <w:br/>
+        <w:t>SECURE_SSL_REDIRECT=0</w:t>
+        <w:br/>
+        <w:t>SECURE_HSTS_SECONDS=31536000</w:t>
+        <w:br/>
+        <w:br/>
+        <w:t># === Variant B/C üçün yuxarıdakı yerinə (HTTP daxili) ===</w:t>
+        <w:br/>
+        <w:t># DJANGO_ALLOWED_HOSTS=erp.citypoint.local,portal.citypoint.local,10.20.30.40</w:t>
+        <w:br/>
+        <w:t># DJANGO_CSRF_TRUSTED_ORIGINS=http://erp.citypoint.local,http://portal.citypoint.local</w:t>
+        <w:br/>
+        <w:t># SESSION_COOKIE_SECURE=0</w:t>
+        <w:br/>
+        <w:t># CSRF_COOKIE_SECURE=0</w:t>
+        <w:br/>
+        <w:t># SECURE_SSL_REDIRECT=0</w:t>
+        <w:br/>
+        <w:t># SECURE_HSTS_SECONDS=0</w:t>
+        <w:br/>
+        <w:br/>
+        <w:t>POSTGRES_DB=citypoint</w:t>
+        <w:br/>
+        <w:t>POSTGRES_USER=cp_app</w:t>
+        <w:br/>
+        <w:t>POSTGRES_PASSWORD=CHANGE_ME_APP</w:t>
+        <w:br/>
+        <w:t>POSTGRES_HOST=127.0.0.1</w:t>
+        <w:br/>
+        <w:t>POSTGRES_PORT=5432</w:t>
+        <w:br/>
+        <w:br/>
+        <w:t>DEFAULT_FROM_EMAIL=noreply@citypoint.local</w:t>
+        <w:br/>
+        <w:t>EMAIL_FILE_PATH=/opt/citypoint/var/mail_outbox</w:t>
+        <w:br/>
+        <w:t># EMAIL_BACKEND=django.core.mail.backends.smtp.EmailBackend</w:t>
+        <w:br/>
+        <w:t># EMAIL_HOST=mail.citypoint.local</w:t>
+        <w:br/>
+        <w:t># EMAIL_PORT=587</w:t>
+        <w:br/>
+        <w:t># EMAIL_HOST_USER=</w:t>
+        <w:br/>
+        <w:t># EMAIL_HOST_PASSWORD=</w:t>
+        <w:br/>
+        <w:t># EMAIL_USE_TLS=1</w:t>
+        <w:br/>
+        <w:br/>
+        <w:t>SESSION_COOKIE_AGE=28800</w:t>
+        <w:br/>
+        <w:t>SESSION_SAVE_EVERY_REQUEST=1</w:t>
+        <w:br/>
+        <w:br/>
+        <w:t># Native-da AxTrax ayrı systemd unit-dir — web startında poller lazım deyil</w:t>
+        <w:br/>
+        <w:t>AXTRAX_POLL_ON_START=0</w:t>
+        <w:br/>
+        <w:t>AXTRAX_BOOTSTRAP_ON_START=0</w:t>
+        <w:br/>
+        <w:t>AXTRAX_POLL_INTERVAL=15</w:t>
+        <w:br/>
+        <w:t>AXTRAX_PEOPLE_SYNC_INTERVAL=300</w:t>
+        <w:br/>
+        <w:t>TURNSTILE_MSSQL_HOST=172.31.104.10</w:t>
+        <w:br/>
+        <w:t>TURNSTILE_MSSQL_PORT=1433</w:t>
+        <w:br/>
+        <w:t>TURNSTILE_MSSQL_DATABASE=AxTrax1</w:t>
+        <w:br/>
+        <w:t>TURNSTILE_MSSQL_USER=ReadOnlyerp</w:t>
+        <w:br/>
+        <w:t>TURNSTILE_MSSQL_PASSWORD=CHANGE_ME</w:t>
+      </w:r>
+    </w:p>
+    <w:p>
+      <w:pPr>
+        <w:pStyle w:val="Heading2"/>
+      </w:pPr>
+      <w:r>
+        <w:rPr>
+          <w:rFonts w:ascii="Calibri" w:hAnsi="Calibri" w:eastAsia="Calibri"/>
+          <w:b/>
+          <w:color w:val="1F497D"/>
+          <w:sz w:val="26"/>
+        </w:rPr>
+        <w:t>22.3 PostgreSQL — bootstrap SQL (TAM)</w:t>
+      </w:r>
+    </w:p>
+    <w:p>
+      <w:pPr>
+        <w:spacing w:before="80" w:after="160"/>
+        <w:ind w:left="283"/>
+      </w:pPr>
+      <w:r>
+        <w:rPr>
+          <w:rFonts w:ascii="Consolas" w:hAnsi="Consolas" w:eastAsia="Consolas"/>
+          <w:sz w:val="16"/>
+        </w:rPr>
+        <w:t>CREATE DATABASE citypoint;</w:t>
+        <w:br/>
+        <w:t>CREATE ROLE cp_migrator LOGIN PASSWORD 'CHANGE_ME_MIGRATOR';</w:t>
+        <w:br/>
+        <w:t>CREATE ROLE cp_app LOGIN PASSWORD 'CHANGE_ME_APP';</w:t>
+        <w:br/>
+        <w:t>CREATE ROLE cp_readonly LOGIN PASSWORD 'CHANGE_ME_READONLY';</w:t>
+        <w:br/>
+        <w:t>GRANT CONNECT ON DATABASE citypoint TO cp_migrator, cp_app, cp_readonly;</w:t>
+        <w:br/>
+        <w:t>\c citypoint</w:t>
+        <w:br/>
+        <w:t>GRANT USAGE ON SCHEMA public TO cp_migrator, cp_app, cp_readonly;</w:t>
+        <w:br/>
+        <w:t>GRANT ALL ON SCHEMA public TO cp_migrator;</w:t>
+        <w:br/>
+        <w:br/>
+        <w:t>-- migrate-dən SONRA:</w:t>
+        <w:br/>
+        <w:t>GRANT SELECT, INSERT, UPDATE, DELETE ON ALL TABLES IN SCHEMA public TO cp_app;</w:t>
+        <w:br/>
+        <w:t>GRANT USAGE, SELECT ON ALL SEQUENCES IN SCHEMA public TO cp_app;</w:t>
+        <w:br/>
+        <w:t>GRANT SELECT ON ALL TABLES IN SCHEMA public TO cp_readonly;</w:t>
+        <w:br/>
+        <w:t>GRANT USAGE, SELECT ON ALL SEQUENCES IN SCHEMA public TO cp_readonly;</w:t>
+        <w:br/>
+        <w:t>ALTER DEFAULT PRIVILEGES FOR ROLE cp_migrator IN SCHEMA public</w:t>
+        <w:br/>
+        <w:t xml:space="preserve">  GRANT SELECT, INSERT, UPDATE, DELETE ON TABLES TO cp_app;</w:t>
+        <w:br/>
+        <w:t>ALTER DEFAULT PRIVILEGES FOR ROLE cp_migrator IN SCHEMA public</w:t>
+        <w:br/>
+        <w:t xml:space="preserve">  GRANT USAGE, SELECT ON SEQUENCES TO cp_app;</w:t>
+        <w:br/>
+        <w:t>ALTER DEFAULT PRIVILEGES FOR ROLE cp_migrator IN SCHEMA public</w:t>
+        <w:br/>
+        <w:t xml:space="preserve">  GRANT SELECT ON TABLES TO cp_readonly;</w:t>
+      </w:r>
+    </w:p>
+    <w:p>
+      <w:pPr>
+        <w:pStyle w:val="Heading2"/>
+      </w:pPr>
+      <w:r>
+        <w:rPr>
+          <w:rFonts w:ascii="Calibri" w:hAnsi="Calibri" w:eastAsia="Calibri"/>
+          <w:b/>
+          <w:color w:val="1F497D"/>
+          <w:sz w:val="26"/>
+        </w:rPr>
+        <w:t>22.4 /etc/systemd/system/citypoint-web.service (TAM)</w:t>
+      </w:r>
+    </w:p>
+    <w:p>
+      <w:pPr>
+        <w:spacing w:before="80" w:after="160"/>
+        <w:ind w:left="283"/>
+      </w:pPr>
+      <w:r>
+        <w:rPr>
+          <w:rFonts w:ascii="Consolas" w:hAnsi="Consolas" w:eastAsia="Consolas"/>
+          <w:sz w:val="16"/>
+        </w:rPr>
+        <w:t>[Unit]</w:t>
+        <w:br/>
+        <w:t>Description=City Point ERP/Portal (Gunicorn)</w:t>
+        <w:br/>
+        <w:t>After=network-online.target postgresql.service</w:t>
+        <w:br/>
+        <w:t>Wants=network-online.target</w:t>
+        <w:br/>
+        <w:t>Requires=postgresql.service</w:t>
+        <w:br/>
+        <w:br/>
+        <w:t>[Service]</w:t>
+        <w:br/>
+        <w:t>Type=simple</w:t>
+        <w:br/>
+        <w:t>User=citypoint</w:t>
+        <w:br/>
+        <w:t>Group=citypoint</w:t>
+        <w:br/>
+        <w:t>WorkingDirectory=/opt/citypoint</w:t>
+        <w:br/>
+        <w:t>EnvironmentFile=/opt/citypoint/bin/prod/.env</w:t>
+        <w:br/>
+        <w:t>ExecStart=/opt/citypoint/.venv/bin/gunicorn config.wsgi:application --bind 127.0.0.1:8000 --workers 3 --timeout 120 --access-logfile - --error-logfile -</w:t>
+        <w:br/>
+        <w:t>Restart=always</w:t>
+        <w:br/>
+        <w:t>RestartSec=5</w:t>
+        <w:br/>
+        <w:br/>
+        <w:t>[Install]</w:t>
+        <w:br/>
+        <w:t>WantedBy=multi-user.target</w:t>
+      </w:r>
+    </w:p>
+    <w:p>
+      <w:pPr>
+        <w:pStyle w:val="Heading2"/>
+      </w:pPr>
+      <w:r>
+        <w:rPr>
+          <w:rFonts w:ascii="Calibri" w:hAnsi="Calibri" w:eastAsia="Calibri"/>
+          <w:b/>
+          <w:color w:val="1F497D"/>
+          <w:sz w:val="26"/>
+        </w:rPr>
+        <w:t>22.5 /etc/systemd/system/citypoint-axtrax.service (TAM)</w:t>
+      </w:r>
+    </w:p>
+    <w:p>
+      <w:pPr>
+        <w:spacing w:before="80" w:after="160"/>
+        <w:ind w:left="283"/>
+      </w:pPr>
+      <w:r>
+        <w:rPr>
+          <w:rFonts w:ascii="Consolas" w:hAnsi="Consolas" w:eastAsia="Consolas"/>
+          <w:sz w:val="16"/>
+        </w:rPr>
+        <w:t>[Unit]</w:t>
+        <w:br/>
+        <w:t>Description=City Point AxTrax poller</w:t>
+        <w:br/>
+        <w:t>After=network-online.target postgresql.service</w:t>
+        <w:br/>
+        <w:t>Wants=network-online.target</w:t>
+        <w:br/>
+        <w:br/>
+        <w:t>[Service]</w:t>
+        <w:br/>
+        <w:t>Type=simple</w:t>
+        <w:br/>
+        <w:t>User=citypoint</w:t>
+        <w:br/>
+        <w:t>Group=citypoint</w:t>
+        <w:br/>
+        <w:t>WorkingDirectory=/opt/citypoint</w:t>
+        <w:br/>
+        <w:t>EnvironmentFile=/opt/citypoint/bin/prod/.env</w:t>
+        <w:br/>
+        <w:t>ExecStart=/opt/citypoint/.venv/bin/python manage.py poll_axtrax</w:t>
+        <w:br/>
+        <w:t>Restart=always</w:t>
+        <w:br/>
+        <w:t>RestartSec=15</w:t>
+        <w:br/>
+        <w:br/>
+        <w:t>[Install]</w:t>
+        <w:br/>
+        <w:t>WantedBy=multi-user.target</w:t>
+      </w:r>
+    </w:p>
+    <w:p>
+      <w:pPr>
+        <w:pStyle w:val="Heading2"/>
+      </w:pPr>
+      <w:r>
+        <w:rPr>
+          <w:rFonts w:ascii="Calibri" w:hAnsi="Calibri" w:eastAsia="Calibri"/>
+          <w:b/>
+          <w:color w:val="1F497D"/>
+          <w:sz w:val="26"/>
+        </w:rPr>
+        <w:t>22.6 Nginx — Variant A portal public (TAM)</w:t>
+      </w:r>
+    </w:p>
+    <w:p>
+      <w:pPr>
+        <w:spacing w:before="80" w:after="160"/>
+        <w:ind w:left="283"/>
+      </w:pPr>
+      <w:r>
+        <w:rPr>
+          <w:rFonts w:ascii="Consolas" w:hAnsi="Consolas" w:eastAsia="Consolas"/>
+          <w:sz w:val="16"/>
+        </w:rPr>
+        <w:t># /etc/nginx/conf.d/citypoint-portal-public.conf</w:t>
+        <w:br/>
+        <w:t>limit_req_zone $binary_remote_addr zone=cp_login:10m rate=5r/m;</w:t>
+        <w:br/>
+        <w:br/>
+        <w:t>server {</w:t>
+        <w:br/>
+        <w:t xml:space="preserve">    listen 443 ssl http2;</w:t>
+        <w:br/>
+        <w:t xml:space="preserve">    server_name portal.citypoint.az;</w:t>
+        <w:br/>
+        <w:t xml:space="preserve">    ssl_certificate     /etc/pki/tls/certs/portal.citypoint.az.crt;</w:t>
+        <w:br/>
+        <w:t xml:space="preserve">    ssl_certificate_key /etc/pki/tls/private/portal.citypoint.az.key;</w:t>
+        <w:br/>
+        <w:t xml:space="preserve">    client_max_body_size 50M;</w:t>
+        <w:br/>
+        <w:br/>
+        <w:t xml:space="preserve">    location /static/ { alias /opt/citypoint/staticfiles/; }</w:t>
+        <w:br/>
+        <w:t xml:space="preserve">    location /media/  { alias /opt/citypoint/media/; }</w:t>
+        <w:br/>
+        <w:br/>
+        <w:t xml:space="preserve">    location /erp/      { return 404; }</w:t>
+        <w:br/>
+        <w:t xml:space="preserve">    location /admin/    { return 404; }</w:t>
+        <w:br/>
+        <w:t xml:space="preserve">    location /security/ { return 404; }</w:t>
+        <w:br/>
+        <w:br/>
+        <w:t xml:space="preserve">    location /login/ {</w:t>
+        <w:br/>
+        <w:t xml:space="preserve">        limit_req zone=cp_login burst=10 nodelay;</w:t>
+        <w:br/>
+        <w:t xml:space="preserve">        proxy_pass http://127.0.0.1:8000;</w:t>
+        <w:br/>
+        <w:t xml:space="preserve">        proxy_set_header Host $host;</w:t>
+        <w:br/>
+        <w:t xml:space="preserve">        proxy_set_header X-Forwarded-For $proxy_add_x_forwarded_for;</w:t>
+        <w:br/>
+        <w:t xml:space="preserve">        proxy_set_header X-Forwarded-Proto https;</w:t>
+        <w:br/>
+        <w:t xml:space="preserve">    }</w:t>
+        <w:br/>
+        <w:br/>
+        <w:t xml:space="preserve">    location / {</w:t>
+        <w:br/>
+        <w:t xml:space="preserve">        proxy_pass http://127.0.0.1:8000;</w:t>
+        <w:br/>
+        <w:t xml:space="preserve">        proxy_set_header Host $host;</w:t>
+        <w:br/>
+        <w:t xml:space="preserve">        proxy_set_header X-Forwarded-For $proxy_add_x_forwarded_for;</w:t>
+        <w:br/>
+        <w:t xml:space="preserve">        proxy_set_header X-Forwarded-Proto https;</w:t>
+        <w:br/>
+        <w:t xml:space="preserve">    }</w:t>
+        <w:br/>
+        <w:t>}</w:t>
+        <w:br/>
+        <w:t>server {</w:t>
+        <w:br/>
+        <w:t xml:space="preserve">    listen 80;</w:t>
+        <w:br/>
+        <w:t xml:space="preserve">    server_name portal.citypoint.az;</w:t>
+        <w:br/>
+        <w:t xml:space="preserve">    return 301 https://$host$request_uri;</w:t>
+        <w:br/>
+        <w:t>}</w:t>
+      </w:r>
+    </w:p>
+    <w:p>
+      <w:pPr>
+        <w:pStyle w:val="Heading2"/>
+      </w:pPr>
+      <w:r>
+        <w:rPr>
+          <w:rFonts w:ascii="Calibri" w:hAnsi="Calibri" w:eastAsia="Calibri"/>
+          <w:b/>
+          <w:color w:val="1F497D"/>
+          <w:sz w:val="26"/>
+        </w:rPr>
+        <w:t>22.7 Nginx — Variant A ERP internal (TAM)</w:t>
+      </w:r>
+    </w:p>
+    <w:p>
+      <w:pPr>
+        <w:spacing w:before="80" w:after="160"/>
+        <w:ind w:left="283"/>
+      </w:pPr>
+      <w:r>
+        <w:rPr>
+          <w:rFonts w:ascii="Consolas" w:hAnsi="Consolas" w:eastAsia="Consolas"/>
+          <w:sz w:val="16"/>
+        </w:rPr>
+        <w:t># /etc/nginx/conf.d/citypoint-erp-internal.conf</w:t>
+        <w:br/>
+        <w:t>server {</w:t>
+        <w:br/>
+        <w:t xml:space="preserve">    listen 443 ssl http2;</w:t>
+        <w:br/>
+        <w:t xml:space="preserve">    server_name erp.citypoint.local;</w:t>
+        <w:br/>
+        <w:t xml:space="preserve">    ssl_certificate     /etc/pki/tls/certs/erp.citypoint.local.crt;</w:t>
+        <w:br/>
+        <w:t xml:space="preserve">    ssl_certificate_key /etc/pki/tls/private/erp.citypoint.local.key;</w:t>
+        <w:br/>
+        <w:t xml:space="preserve">    client_max_body_size 50M;</w:t>
+        <w:br/>
+        <w:t xml:space="preserve">    location /static/ { alias /opt/citypoint/staticfiles/; }</w:t>
+        <w:br/>
+        <w:t xml:space="preserve">    location /media/  { alias /opt/citypoint/media/; }</w:t>
+        <w:br/>
+        <w:t xml:space="preserve">    location / {</w:t>
+        <w:br/>
+        <w:t xml:space="preserve">        proxy_pass http://127.0.0.1:8000;</w:t>
+        <w:br/>
+        <w:t xml:space="preserve">        proxy_set_header Host $host;</w:t>
+        <w:br/>
+        <w:t xml:space="preserve">        proxy_set_header X-Forwarded-For $proxy_add_x_forwarded_for;</w:t>
+        <w:br/>
+        <w:t xml:space="preserve">        proxy_set_header X-Forwarded-Proto https;</w:t>
+        <w:br/>
+        <w:t xml:space="preserve">    }</w:t>
+        <w:br/>
+        <w:t>}</w:t>
+      </w:r>
+    </w:p>
+    <w:p>
+      <w:pPr>
+        <w:pStyle w:val="Heading2"/>
+      </w:pPr>
+      <w:r>
+        <w:rPr>
+          <w:rFonts w:ascii="Calibri" w:hAnsi="Calibri" w:eastAsia="Calibri"/>
+          <w:b/>
+          <w:color w:val="1F497D"/>
+          <w:sz w:val="26"/>
+        </w:rPr>
+        <w:t>22.8 Nginx — Variant B/C daxili HTTP (TAM)</w:t>
+      </w:r>
+    </w:p>
+    <w:p>
+      <w:pPr>
+        <w:spacing w:before="80" w:after="160"/>
+        <w:ind w:left="283"/>
+      </w:pPr>
+      <w:r>
+        <w:rPr>
+          <w:rFonts w:ascii="Consolas" w:hAnsi="Consolas" w:eastAsia="Consolas"/>
+          <w:sz w:val="16"/>
+        </w:rPr>
+        <w:t># /etc/nginx/conf.d/citypoint-internal.conf</w:t>
+        <w:br/>
+        <w:t>server {</w:t>
+        <w:br/>
+        <w:t xml:space="preserve">    listen 80;</w:t>
+        <w:br/>
+        <w:t xml:space="preserve">    server_name portal.citypoint.local erp.citypoint.local;</w:t>
+        <w:br/>
+        <w:t xml:space="preserve">    client_max_body_size 50M;</w:t>
+        <w:br/>
+        <w:t xml:space="preserve">    location /static/ { alias /opt/citypoint/staticfiles/; }</w:t>
+        <w:br/>
+        <w:t xml:space="preserve">    location /media/  { alias /opt/citypoint/media/; }</w:t>
+        <w:br/>
+        <w:t xml:space="preserve">    location / {</w:t>
+        <w:br/>
+        <w:t xml:space="preserve">        proxy_pass http://127.0.0.1:8000;</w:t>
+        <w:br/>
+        <w:t xml:space="preserve">        proxy_set_header Host $host;</w:t>
+        <w:br/>
+        <w:t xml:space="preserve">        proxy_set_header X-Forwarded-For $proxy_add_x_forwarded_for;</w:t>
+        <w:br/>
+        <w:t xml:space="preserve">        proxy_set_header X-Forwarded-Proto $scheme;</w:t>
+        <w:br/>
+        <w:t xml:space="preserve">    }</w:t>
+        <w:br/>
+        <w:t>}</w:t>
+      </w:r>
+    </w:p>
+    <w:p>
+      <w:pPr>
+        <w:pStyle w:val="Heading2"/>
+      </w:pPr>
+      <w:r>
+        <w:rPr>
+          <w:rFonts w:ascii="Calibri" w:hAnsi="Calibri" w:eastAsia="Calibri"/>
+          <w:b/>
+          <w:color w:val="1F497D"/>
+          <w:sz w:val="26"/>
+        </w:rPr>
+        <w:t>22.9 Invite / admin əmrləri</w:t>
+      </w:r>
+    </w:p>
+    <w:p>
+      <w:pPr>
+        <w:spacing w:before="80" w:after="160"/>
+        <w:ind w:left="283"/>
+      </w:pPr>
+      <w:r>
+        <w:rPr>
+          <w:rFonts w:ascii="Consolas" w:hAnsi="Consolas" w:eastAsia="Consolas"/>
+          <w:sz w:val="16"/>
+        </w:rPr>
+        <w:t>CP='sudo -u citypoint -H bash -c'</w:t>
+        <w:br/>
+        <w:t>RUN='cd /opt/citypoint &amp;&amp; source .venv/bin/activate &amp;&amp; set -a &amp;&amp; source bin/prod/.env &amp;&amp; set +a'</w:t>
+        <w:br/>
+        <w:br/>
+        <w:t># Superuser (bir dəfə)</w:t>
+        <w:br/>
+        <w:t>$CP "$RUN &amp;&amp; python manage.py createsuperuser"</w:t>
+        <w:br/>
+        <w:br/>
+        <w:t># Rezident portal invite</w:t>
+        <w:br/>
+        <w:t>$CP "$RUN &amp;&amp; python manage.py invite_portal_user \</w:t>
+        <w:br/>
+        <w:t xml:space="preserve">  --email=office@tenant.az --company=COMPANY_SLUG \</w:t>
+        <w:br/>
+        <w:t xml:space="preserve">  --first-name=Office --last-name=Manager \</w:t>
+        <w:br/>
+        <w:t xml:space="preserve">  --base-url=https://portal.citypoint.az --send-email"</w:t>
+        <w:br/>
+        <w:br/>
+        <w:t># Mail göndərilməyibsə:</w:t>
+        <w:br/>
+        <w:t>ls -lt /opt/citypoint/var/mail_outbox | head</w:t>
+        <w:br/>
+        <w:br/>
+        <w:t># Uğursuz invite mailləri yenidən</w:t>
+        <w:br/>
+        <w:t>$CP "$RUN &amp;&amp; python manage.py retry_invite_emails"</w:t>
+      </w:r>
+    </w:p>
+    <w:p>
+      <w:pPr>
+        <w:pStyle w:val="Heading2"/>
+      </w:pPr>
+      <w:r>
+        <w:rPr>
+          <w:rFonts w:ascii="Calibri" w:hAnsi="Calibri" w:eastAsia="Calibri"/>
+          <w:b/>
+          <w:color w:val="1F497D"/>
+          <w:sz w:val="26"/>
+        </w:rPr>
+        <w:t>22.10 USB paket checklist (build → prod)</w:t>
+      </w:r>
+    </w:p>
+    <w:tbl>
+      <w:tblPr>
+        <w:tblStyle w:val="TableGrid"/>
+        <w:tblW w:type="auto" w:w="0"/>
+        <w:tblLook w:firstColumn="1" w:firstRow="1" w:lastColumn="0" w:lastRow="0" w:noHBand="0" w:noVBand="1" w:val="04A0"/>
+      </w:tblPr>
+      <w:tblGrid>
+        <w:gridCol w:w="3249"/>
+        <w:gridCol w:w="3249"/>
+        <w:gridCol w:w="3249"/>
+      </w:tblGrid>
+      <w:tr>
+        <w:tc>
+          <w:tcPr>
+            <w:tcW w:type="dxa" w:w="3249"/>
+          </w:tcPr>
+          <w:p>
+            <w:r/>
+            <w:r>
+              <w:rPr>
+                <w:rFonts w:ascii="Calibri" w:hAnsi="Calibri" w:eastAsia="Calibri"/>
+                <w:b/>
+                <w:sz w:val="18"/>
+              </w:rPr>
+              <w:t>USB yolu</w:t>
+            </w:r>
+          </w:p>
+        </w:tc>
+        <w:tc>
+          <w:tcPr>
+            <w:tcW w:type="dxa" w:w="3249"/>
+          </w:tcPr>
+          <w:p>
+            <w:r/>
+            <w:r>
+              <w:rPr>
+                <w:rFonts w:ascii="Calibri" w:hAnsi="Calibri" w:eastAsia="Calibri"/>
+                <w:b/>
+                <w:sz w:val="18"/>
+              </w:rPr>
+              <w:t>Məzmun</w:t>
+            </w:r>
+          </w:p>
+        </w:tc>
+        <w:tc>
+          <w:tcPr>
+            <w:tcW w:type="dxa" w:w="3249"/>
+          </w:tcPr>
+          <w:p>
+            <w:r/>
+            <w:r>
+              <w:rPr>
+                <w:rFonts w:ascii="Calibri" w:hAnsi="Calibri" w:eastAsia="Calibri"/>
+                <w:b/>
+                <w:sz w:val="18"/>
+              </w:rPr>
+              <w:t>Prod-da hara</w:t>
+            </w:r>
+          </w:p>
+        </w:tc>
+      </w:tr>
+      <w:tr>
+        <w:tc>
+          <w:tcPr>
+            <w:tcW w:type="dxa" w:w="3249"/>
+          </w:tcPr>
+          <w:p>
+            <w:r/>
+            <w:r>
+              <w:rPr>
+                <w:rFonts w:ascii="Calibri" w:hAnsi="Calibri" w:eastAsia="Calibri"/>
+                <w:b w:val="0"/>
+                <w:sz w:val="18"/>
+              </w:rPr>
+              <w:t>citypoint-app.zip</w:t>
+            </w:r>
+          </w:p>
+        </w:tc>
+        <w:tc>
+          <w:tcPr>
+            <w:tcW w:type="dxa" w:w="3249"/>
+          </w:tcPr>
+          <w:p>
+            <w:r/>
+            <w:r>
+              <w:rPr>
+                <w:rFonts w:ascii="Calibri" w:hAnsi="Calibri" w:eastAsia="Calibri"/>
+                <w:b w:val="0"/>
+                <w:sz w:val="18"/>
+              </w:rPr>
+              <w:t>Django repo (git archive)</w:t>
+            </w:r>
+          </w:p>
+        </w:tc>
+        <w:tc>
+          <w:tcPr>
+            <w:tcW w:type="dxa" w:w="3249"/>
+          </w:tcPr>
+          <w:p>
+            <w:r/>
+            <w:r>
+              <w:rPr>
+                <w:rFonts w:ascii="Calibri" w:hAnsi="Calibri" w:eastAsia="Calibri"/>
+                <w:b w:val="0"/>
+                <w:sz w:val="18"/>
+              </w:rPr>
+              <w:t>/opt/citypoint</w:t>
+            </w:r>
+          </w:p>
+        </w:tc>
+      </w:tr>
+      <w:tr>
+        <w:tc>
+          <w:tcPr>
+            <w:tcW w:type="dxa" w:w="3249"/>
+          </w:tcPr>
+          <w:p>
+            <w:r/>
+            <w:r>
+              <w:rPr>
+                <w:rFonts w:ascii="Calibri" w:hAnsi="Calibri" w:eastAsia="Calibri"/>
+                <w:b w:val="0"/>
+                <w:sz w:val="18"/>
+              </w:rPr>
+              <w:t>wheelhouse/</w:t>
+            </w:r>
+          </w:p>
+        </w:tc>
+        <w:tc>
+          <w:tcPr>
+            <w:tcW w:type="dxa" w:w="3249"/>
+          </w:tcPr>
+          <w:p>
+            <w:r/>
+            <w:r>
+              <w:rPr>
+                <w:rFonts w:ascii="Calibri" w:hAnsi="Calibri" w:eastAsia="Calibri"/>
+                <w:b w:val="0"/>
+                <w:sz w:val="18"/>
+              </w:rPr>
+              <w:t>pip download nəticəsi</w:t>
+            </w:r>
+          </w:p>
+        </w:tc>
+        <w:tc>
+          <w:tcPr>
+            <w:tcW w:type="dxa" w:w="3249"/>
+          </w:tcPr>
+          <w:p>
+            <w:r/>
+            <w:r>
+              <w:rPr>
+                <w:rFonts w:ascii="Calibri" w:hAnsi="Calibri" w:eastAsia="Calibri"/>
+                <w:b w:val="0"/>
+                <w:sz w:val="18"/>
+              </w:rPr>
+              <w:t>/opt/offline/wheelhouse</w:t>
+            </w:r>
+          </w:p>
+        </w:tc>
+      </w:tr>
+      <w:tr>
+        <w:tc>
+          <w:tcPr>
+            <w:tcW w:type="dxa" w:w="3249"/>
+          </w:tcPr>
+          <w:p>
+            <w:r/>
+            <w:r>
+              <w:rPr>
+                <w:rFonts w:ascii="Calibri" w:hAnsi="Calibri" w:eastAsia="Calibri"/>
+                <w:b w:val="0"/>
+                <w:sz w:val="18"/>
+              </w:rPr>
+              <w:t>rpms/</w:t>
+            </w:r>
+          </w:p>
+        </w:tc>
+        <w:tc>
+          <w:tcPr>
+            <w:tcW w:type="dxa" w:w="3249"/>
+          </w:tcPr>
+          <w:p>
+            <w:r/>
+            <w:r>
+              <w:rPr>
+                <w:rFonts w:ascii="Calibri" w:hAnsi="Calibri" w:eastAsia="Calibri"/>
+                <w:b w:val="0"/>
+                <w:sz w:val="18"/>
+              </w:rPr>
+              <w:t>dnf download + createrepo_c</w:t>
+            </w:r>
+          </w:p>
+        </w:tc>
+        <w:tc>
+          <w:tcPr>
+            <w:tcW w:type="dxa" w:w="3249"/>
+          </w:tcPr>
+          <w:p>
+            <w:r/>
+            <w:r>
+              <w:rPr>
+                <w:rFonts w:ascii="Calibri" w:hAnsi="Calibri" w:eastAsia="Calibri"/>
+                <w:b w:val="0"/>
+                <w:sz w:val="18"/>
+              </w:rPr>
+              <w:t>/opt/offline/rpms</w:t>
+            </w:r>
+          </w:p>
+        </w:tc>
+      </w:tr>
+      <w:tr>
+        <w:tc>
+          <w:tcPr>
+            <w:tcW w:type="dxa" w:w="3249"/>
+          </w:tcPr>
+          <w:p>
+            <w:r/>
+            <w:r>
+              <w:rPr>
+                <w:rFonts w:ascii="Calibri" w:hAnsi="Calibri" w:eastAsia="Calibri"/>
+                <w:b w:val="0"/>
+                <w:sz w:val="18"/>
+              </w:rPr>
+              <w:t>certs/ (opsional)</w:t>
+            </w:r>
+          </w:p>
+        </w:tc>
+        <w:tc>
+          <w:tcPr>
+            <w:tcW w:type="dxa" w:w="3249"/>
+          </w:tcPr>
+          <w:p>
+            <w:r/>
+            <w:r>
+              <w:rPr>
+                <w:rFonts w:ascii="Calibri" w:hAnsi="Calibri" w:eastAsia="Calibri"/>
+                <w:b w:val="0"/>
+                <w:sz w:val="18"/>
+              </w:rPr>
+              <w:t>portal/erp .crt/.key</w:t>
+            </w:r>
+          </w:p>
+        </w:tc>
+        <w:tc>
+          <w:tcPr>
+            <w:tcW w:type="dxa" w:w="3249"/>
+          </w:tcPr>
+          <w:p>
+            <w:r/>
+            <w:r>
+              <w:rPr>
+                <w:rFonts w:ascii="Calibri" w:hAnsi="Calibri" w:eastAsia="Calibri"/>
+                <w:b w:val="0"/>
+                <w:sz w:val="18"/>
+              </w:rPr>
+              <w:t>/etc/pki/tls/...</w:t>
+            </w:r>
+          </w:p>
+        </w:tc>
+      </w:tr>
+      <w:tr>
+        <w:tc>
+          <w:tcPr>
+            <w:tcW w:type="dxa" w:w="3249"/>
+          </w:tcPr>
+          <w:p>
+            <w:r/>
+            <w:r>
+              <w:rPr>
+                <w:rFonts w:ascii="Calibri" w:hAnsi="Calibri" w:eastAsia="Calibri"/>
+                <w:b w:val="0"/>
+                <w:sz w:val="18"/>
+              </w:rPr>
+              <w:t>Bu Word sənədi</w:t>
+            </w:r>
+          </w:p>
+        </w:tc>
+        <w:tc>
+          <w:tcPr>
+            <w:tcW w:type="dxa" w:w="3249"/>
+          </w:tcPr>
+          <w:p>
+            <w:r/>
+            <w:r>
+              <w:rPr>
+                <w:rFonts w:ascii="Calibri" w:hAnsi="Calibri" w:eastAsia="Calibri"/>
+                <w:b w:val="0"/>
+                <w:sz w:val="18"/>
+              </w:rPr>
+              <w:t>NetAdmin rəhbəri</w:t>
+            </w:r>
+          </w:p>
+        </w:tc>
+        <w:tc>
+          <w:tcPr>
+            <w:tcW w:type="dxa" w:w="3249"/>
+          </w:tcPr>
+          <w:p>
+            <w:r/>
+            <w:r>
+              <w:rPr>
+                <w:rFonts w:ascii="Calibri" w:hAnsi="Calibri" w:eastAsia="Calibri"/>
+                <w:b w:val="0"/>
+                <w:sz w:val="18"/>
+              </w:rPr>
+              <w:t>ops laptop / print</w:t>
+            </w:r>
+          </w:p>
+        </w:tc>
+      </w:tr>
+    </w:tbl>
+    <w:p/>
+    <w:p>
+      <w:pPr>
+        <w:pStyle w:val="Heading1"/>
+      </w:pPr>
+      <w:r>
+        <w:rPr>
+          <w:rFonts w:ascii="Calibri" w:hAnsi="Calibri" w:eastAsia="Calibri"/>
+          <w:b/>
+          <w:color w:val="1F497D"/>
+          <w:sz w:val="32"/>
+        </w:rPr>
+        <w:t>23. Qəbul imzası</w:t>
       </w:r>
     </w:p>
     <w:tbl>
@@ -5355,7 +7086,7 @@
                 <w:b w:val="0"/>
                 <w:sz w:val="18"/>
               </w:rPr>
-              <w:t>NetAdmin</w:t>
+              <w:t>NetAdmin (İnternet yox / variant təsdiqi)</w:t>
             </w:r>
           </w:p>
         </w:tc>
@@ -5418,7 +7149,7 @@
                 <w:b w:val="0"/>
                 <w:sz w:val="18"/>
               </w:rPr>
-              <w:t>SysAdmin</w:t>
+              <w:t>SysAdmin (native quraşdırma)</w:t>
             </w:r>
           </w:p>
         </w:tc>
@@ -5481,7 +7212,7 @@
                 <w:b w:val="0"/>
                 <w:sz w:val="18"/>
               </w:rPr>
-              <w:t>ERP ops</w:t>
+              <w:t>ERP ops (migrate / invite / smoke)</w:t>
             </w:r>
           </w:p>
         </w:tc>
@@ -5607,7 +7338,7 @@
           <w:b w:val="0"/>
           <w:sz w:val="18"/>
         </w:rPr>
-        <w:t>— City Point ERP · NetAdmin rəhbəri · Confidential —</w:t>
+        <w:t>— City Point ERP · NetAdmin rəhbəri v3.0 · ÖZÜNÜ-KİFAYƏT · Confidential —</w:t>
       </w:r>
     </w:p>
     <w:sectPr>

</xml_diff>